<commit_message>
fix: remove all em-dashes from advisory board pack Word docs
</commit_message>
<xml_diff>
--- a/docs/advisory-board-pack/1 - Cover Letter Mariam.docx
+++ b/docs/advisory-board-pack/1 - Cover Letter Mariam.docx
@@ -18,7 +18,7 @@
           <w:b/>
           <w:sz w:val="28"/>
         </w:rPr>
-        <w:t>Clinical Advisory Board — Welcome Pack</w:t>
+        <w:t>Clinical Advisory Board - Welcome Pack</w:t>
       </w:r>
     </w:p>
     <w:p>
@@ -30,7 +30,7 @@
           <w:color w:val="CCCCCC"/>
           <w:sz w:val="16"/>
         </w:rPr>
-        <w:t>────────────────────────────────────────────────────────────────────────</w:t>
+        <w:t>------------------------------------------------------------------------</w:t>
       </w:r>
     </w:p>
     <w:p>
@@ -160,7 +160,7 @@
         <w:ind w:left="432"/>
       </w:pPr>
       <w:r>
-        <w:t>The log we will use to record your formal sign-off of clinical content in your area of expertise. For reference — you will use this as we develop content together.</w:t>
+        <w:t>The log we will use to record your formal sign-off of clinical content in your area of expertise. For reference - you will use this as we develop content together.</w:t>
       </w:r>
     </w:p>
     <w:p>

</xml_diff>